<commit_message>
Template Update Step 1
</commit_message>
<xml_diff>
--- a/SIoTSecOntology/Formal_Abstraction_Stage/Step_2_Ontology_Reuse/00_Ontology_Reuse_Template.docx
+++ b/SIoTSecOntology/Formal_Abstraction_Stage/Step_2_Ontology_Reuse/00_Ontology_Reuse_Template.docx
@@ -258,7 +258,15 @@
           </w:tcPr>
           <w:p>
             <w:r>
-              <w:t xml:space="preserve">Colocar qui el nombre de la ontología o vocabulario controlado.  </w:t>
+              <w:t xml:space="preserve">Colocar </w:t>
+            </w:r>
+            <w:r>
+              <w:t>a</w:t>
+            </w:r>
+            <w:bookmarkStart w:id="0" w:name="_GoBack"/>
+            <w:bookmarkEnd w:id="0"/>
+            <w:r>
+              <w:t xml:space="preserve">qui el nombre de la ontología o vocabulario controlado.  </w:t>
             </w:r>
           </w:p>
         </w:tc>
@@ -340,7 +348,7 @@
             <w:pPr>
               <w:cnfStyle w:val="000000100000" w:firstRow="0" w:lastRow="0" w:firstColumn="0" w:lastColumn="0" w:oddVBand="0" w:evenVBand="0" w:oddHBand="1" w:evenHBand="0" w:firstRowFirstColumn="0" w:firstRowLastColumn="0" w:lastRowFirstColumn="0" w:lastRowLastColumn="0"/>
             </w:pPr>
-            <w:hyperlink r:id="rId8" w:history="1">
+            <w:hyperlink r:id="rId8" w:anchor="Developments" w:history="1">
               <w:r>
                 <w:rPr>
                   <w:rStyle w:val="Hipervnculo"/>
@@ -489,8 +497,6 @@
                   <w:r>
                     <w:t xml:space="preserve"> </w:t>
                   </w:r>
-                  <w:bookmarkStart w:id="0" w:name="_GoBack"/>
-                  <w:bookmarkEnd w:id="0"/>
                 </w:p>
                 <w:p/>
                 <w:p>
@@ -701,7 +707,7 @@
             <w:rPr>
               <w:noProof/>
             </w:rPr>
-            <w:t>2024</w:t>
+            <w:t>2026</w:t>
           </w:r>
           <w:r>
             <w:fldChar w:fldCharType="end"/>

</xml_diff>